<commit_message>
fix(export): clean dashboard export and link directly to Academic Cloud (GWDG)
</commit_message>
<xml_diff>
--- a/HOW_TO_RECORD_VOICE.docx
+++ b/HOW_TO_RECORD_VOICE.docx
@@ -421,7 +421,7 @@
                 <w:color w:val="0D9488"/>
                 <w:sz w:val="17"/>
               </w:rPr>
-              <w:t>[Paste GitHub Pages URL here]</w:t>
+              <w:t>https://smitpatel37.github.io/night-fast-voice-study/</w:t>
             </w:r>
           </w:p>
         </w:tc>
@@ -448,7 +448,7 @@
                 <w:color w:val="1E3A8A"/>
                 <w:sz w:val="17"/>
               </w:rPr>
-              <w:t>☁️ Nextcloud Drop:</w:t>
+              <w:t>☁️ Academic Cloud:</w:t>
             </w:r>
           </w:p>
         </w:tc>
@@ -462,7 +462,7 @@
                 <w:color w:val="0D9488"/>
                 <w:sz w:val="17"/>
               </w:rPr>
-              <w:t>[Paste Nextcloud Folder URL here]</w:t>
+              <w:t>https://gwdg.files.academiccloud.de/s/3KeMrJed3ydoDTN</w:t>
             </w:r>
           </w:p>
         </w:tc>

</xml_diff>